<commit_message>
Declarações Pai e Mar finalizadas e enviadas a Roselia, Manual IA v7, e arquivo de duvidas a Roselia
</commit_message>
<xml_diff>
--- a/IR2026/Duvidas Roselia.docx
+++ b/IR2026/Duvidas Roselia.docx
@@ -29,108 +29,75 @@
     </w:p>
     <w:p>
       <w:pPr>
-        <w:numPr>
-          <w:ilvl w:val="0"/>
-          <w:numId w:val="3"/>
-        </w:numPr>
+        <w:rPr>
+          <w:b/>
+          <w:bCs/>
+        </w:rPr>
       </w:pPr>
       <w:r>
-        <w:t>Esclarece o que foi feito com os imóveis e como refletir isso nas declarações.</w:t>
+        <w:rPr>
+          <w:b/>
+          <w:bCs/>
+        </w:rPr>
+        <w:t xml:space="preserve">Declaração da </w:t>
+      </w:r>
+      <w:proofErr w:type="spellStart"/>
+      <w:r>
+        <w:rPr>
+          <w:b/>
+          <w:bCs/>
+        </w:rPr>
+        <w:t>Viuva</w:t>
+      </w:r>
+      <w:proofErr w:type="spellEnd"/>
+      <w:r>
+        <w:rPr>
+          <w:b/>
+          <w:bCs/>
+        </w:rPr>
+        <w:t xml:space="preserve"> Meeira</w:t>
       </w:r>
     </w:p>
     <w:p>
       <w:pPr>
+        <w:pStyle w:val="ListParagraph"/>
         <w:ind w:left="1440"/>
       </w:pPr>
     </w:p>
     <w:p>
       <w:pPr>
+        <w:pStyle w:val="ListParagraph"/>
         <w:numPr>
-          <w:ilvl w:val="1"/>
-          <w:numId w:val="3"/>
+          <w:ilvl w:val="0"/>
+          <w:numId w:val="10"/>
         </w:numPr>
       </w:pPr>
       <w:r>
-        <w:t xml:space="preserve">Os filhos receberam 1/3 de 50% de cada </w:t>
+        <w:t xml:space="preserve">Ao declarar a transferência de bens do espolio para a mãe, deve-se utilizar qual Tipo de Rendimento? 14 Transferências Patrimoniais – Doações ou Heranças, ou 19 </w:t>
       </w:r>
       <w:proofErr w:type="spellStart"/>
       <w:r>
-        <w:t>casa</w:t>
-      </w:r>
-      <w:r>
-        <w:t>ForteGB</w:t>
+        <w:t>Tranferências</w:t>
       </w:r>
       <w:proofErr w:type="spellEnd"/>
       <w:r>
-        <w:t>: atualização de custos Casa 02, 03, 04 e 05</w:t>
+        <w:t xml:space="preserve"> Patrimoniais – Meação e Dissolução da Sociedade Conjugal e da Unidade Familiar? No 14 é possível indicar o doador/espólio, no 19 não tem como</w:t>
+      </w:r>
+      <w:r>
+        <w:t xml:space="preserve">. Mantive 19 na declaração. Não tem como colocar descrição. </w:t>
       </w:r>
     </w:p>
+    <w:p/>
     <w:p>
       <w:pPr>
+        <w:pStyle w:val="ListParagraph"/>
         <w:numPr>
-          <w:ilvl w:val="1"/>
-          <w:numId w:val="3"/>
+          <w:ilvl w:val="0"/>
+          <w:numId w:val="10"/>
         </w:numPr>
       </w:pPr>
       <w:r>
-        <w:t>A mãe recebeu 50% de cada imóvel</w:t>
-      </w:r>
-    </w:p>
-    <w:p>
-      <w:pPr>
-        <w:numPr>
-          <w:ilvl w:val="1"/>
-          <w:numId w:val="3"/>
-        </w:numPr>
-      </w:pPr>
-      <w:r>
-        <w:t xml:space="preserve">A mãe doou esses 50% de cada imóvel para os filhos (1/3 para </w:t>
-      </w:r>
-      <w:proofErr w:type="gramStart"/>
-      <w:r>
-        <w:t>cada?,</w:t>
-      </w:r>
-      <w:proofErr w:type="gramEnd"/>
-      <w:r>
-        <w:t xml:space="preserve"> </w:t>
-      </w:r>
-      <w:proofErr w:type="gramStart"/>
-      <w:r>
-        <w:t>como Declarar</w:t>
-      </w:r>
-      <w:proofErr w:type="gramEnd"/>
-      <w:r>
-        <w:t xml:space="preserve"> isso?)</w:t>
-      </w:r>
-    </w:p>
-    <w:p>
-      <w:pPr>
-        <w:numPr>
-          <w:ilvl w:val="1"/>
-          <w:numId w:val="3"/>
-        </w:numPr>
-      </w:pPr>
-      <w:r>
-        <w:t>Os filhos concordaram</w:t>
-      </w:r>
-      <w:r>
-        <w:t xml:space="preserve"> em ter a posse de 100% (1/3 para cada) com usufruto. Como proceder com a </w:t>
-      </w:r>
-      <w:proofErr w:type="spellStart"/>
-      <w:r>
-        <w:t>delcaracao</w:t>
-      </w:r>
-      <w:proofErr w:type="spellEnd"/>
-      <w:r>
-        <w:t xml:space="preserve">? Entendo que dos filhos eh fácil, basta ter os imóveis na guia bens e direitos, mas tenho que declarar explicitamente na declaração da </w:t>
-      </w:r>
-      <w:proofErr w:type="spellStart"/>
-      <w:r>
-        <w:t>mae</w:t>
-      </w:r>
-      <w:proofErr w:type="spellEnd"/>
-      <w:r>
-        <w:t xml:space="preserve"> e dos filhos essa “doação” da </w:t>
+        <w:t xml:space="preserve">Ao declarar os imóveis na lista de Bens e Direitos, qual valor devo preencher na Situação pra 31/12/2024? 0? A mãe sempre foi declarada como dependente na declaração do pai. Pelo regime de casamento ela tem direito à meação, isso significa que deveria ser lançado nessa data o valor de </w:t>
       </w:r>
       <w:proofErr w:type="spellStart"/>
       <w:r>
@@ -138,12 +105,13 @@
       </w:r>
       <w:proofErr w:type="spellEnd"/>
       <w:r>
-        <w:t xml:space="preserve"> da mae?</w:t>
+        <w:t xml:space="preserve"> do bem? Ou lançado zero em 31/12/2024 e 1/3 do valor total do imóvel correspondente ao usufruo, em 31/12/2025? Provisoriamente, deixei com essa segunda opção na declaração. </w:t>
       </w:r>
     </w:p>
     <w:p>
       <w:pPr>
-        <w:ind w:left="720"/>
+        <w:pStyle w:val="ListParagraph"/>
+        <w:ind w:left="1440"/>
       </w:pPr>
     </w:p>
     <w:p>
@@ -888,6 +856,119 @@
     </w:lvl>
   </w:abstractNum>
   <w:abstractNum w:abstractNumId="6" w15:restartNumberingAfterBreak="0">
+    <w:nsid w:val="588F3760"/>
+    <w:multiLevelType w:val="hybridMultilevel"/>
+    <w:tmpl w:val="2626C5C0"/>
+    <w:lvl w:ilvl="0" w:tplc="04090001">
+      <w:start w:val="1"/>
+      <w:numFmt w:val="bullet"/>
+      <w:lvlText w:val=""/>
+      <w:lvlJc w:val="left"/>
+      <w:pPr>
+        <w:ind w:left="1440" w:hanging="360"/>
+      </w:pPr>
+      <w:rPr>
+        <w:rFonts w:ascii="Symbol" w:hAnsi="Symbol" w:hint="default"/>
+      </w:rPr>
+    </w:lvl>
+    <w:lvl w:ilvl="1" w:tplc="04090003" w:tentative="1">
+      <w:start w:val="1"/>
+      <w:numFmt w:val="bullet"/>
+      <w:lvlText w:val="o"/>
+      <w:lvlJc w:val="left"/>
+      <w:pPr>
+        <w:ind w:left="2160" w:hanging="360"/>
+      </w:pPr>
+      <w:rPr>
+        <w:rFonts w:ascii="Courier New" w:hAnsi="Courier New" w:cs="Courier New" w:hint="default"/>
+      </w:rPr>
+    </w:lvl>
+    <w:lvl w:ilvl="2" w:tplc="04090005" w:tentative="1">
+      <w:start w:val="1"/>
+      <w:numFmt w:val="bullet"/>
+      <w:lvlText w:val=""/>
+      <w:lvlJc w:val="left"/>
+      <w:pPr>
+        <w:ind w:left="2880" w:hanging="360"/>
+      </w:pPr>
+      <w:rPr>
+        <w:rFonts w:ascii="Wingdings" w:hAnsi="Wingdings" w:hint="default"/>
+      </w:rPr>
+    </w:lvl>
+    <w:lvl w:ilvl="3" w:tplc="04090001" w:tentative="1">
+      <w:start w:val="1"/>
+      <w:numFmt w:val="bullet"/>
+      <w:lvlText w:val=""/>
+      <w:lvlJc w:val="left"/>
+      <w:pPr>
+        <w:ind w:left="3600" w:hanging="360"/>
+      </w:pPr>
+      <w:rPr>
+        <w:rFonts w:ascii="Symbol" w:hAnsi="Symbol" w:hint="default"/>
+      </w:rPr>
+    </w:lvl>
+    <w:lvl w:ilvl="4" w:tplc="04090003" w:tentative="1">
+      <w:start w:val="1"/>
+      <w:numFmt w:val="bullet"/>
+      <w:lvlText w:val="o"/>
+      <w:lvlJc w:val="left"/>
+      <w:pPr>
+        <w:ind w:left="4320" w:hanging="360"/>
+      </w:pPr>
+      <w:rPr>
+        <w:rFonts w:ascii="Courier New" w:hAnsi="Courier New" w:cs="Courier New" w:hint="default"/>
+      </w:rPr>
+    </w:lvl>
+    <w:lvl w:ilvl="5" w:tplc="04090005" w:tentative="1">
+      <w:start w:val="1"/>
+      <w:numFmt w:val="bullet"/>
+      <w:lvlText w:val=""/>
+      <w:lvlJc w:val="left"/>
+      <w:pPr>
+        <w:ind w:left="5040" w:hanging="360"/>
+      </w:pPr>
+      <w:rPr>
+        <w:rFonts w:ascii="Wingdings" w:hAnsi="Wingdings" w:hint="default"/>
+      </w:rPr>
+    </w:lvl>
+    <w:lvl w:ilvl="6" w:tplc="04090001" w:tentative="1">
+      <w:start w:val="1"/>
+      <w:numFmt w:val="bullet"/>
+      <w:lvlText w:val=""/>
+      <w:lvlJc w:val="left"/>
+      <w:pPr>
+        <w:ind w:left="5760" w:hanging="360"/>
+      </w:pPr>
+      <w:rPr>
+        <w:rFonts w:ascii="Symbol" w:hAnsi="Symbol" w:hint="default"/>
+      </w:rPr>
+    </w:lvl>
+    <w:lvl w:ilvl="7" w:tplc="04090003" w:tentative="1">
+      <w:start w:val="1"/>
+      <w:numFmt w:val="bullet"/>
+      <w:lvlText w:val="o"/>
+      <w:lvlJc w:val="left"/>
+      <w:pPr>
+        <w:ind w:left="6480" w:hanging="360"/>
+      </w:pPr>
+      <w:rPr>
+        <w:rFonts w:ascii="Courier New" w:hAnsi="Courier New" w:cs="Courier New" w:hint="default"/>
+      </w:rPr>
+    </w:lvl>
+    <w:lvl w:ilvl="8" w:tplc="04090005" w:tentative="1">
+      <w:start w:val="1"/>
+      <w:numFmt w:val="bullet"/>
+      <w:lvlText w:val=""/>
+      <w:lvlJc w:val="left"/>
+      <w:pPr>
+        <w:ind w:left="7200" w:hanging="360"/>
+      </w:pPr>
+      <w:rPr>
+        <w:rFonts w:ascii="Wingdings" w:hAnsi="Wingdings" w:hint="default"/>
+      </w:rPr>
+    </w:lvl>
+  </w:abstractNum>
+  <w:abstractNum w:abstractNumId="7" w15:restartNumberingAfterBreak="0">
     <w:nsid w:val="592058C6"/>
     <w:multiLevelType w:val="multilevel"/>
     <w:tmpl w:val="265CF3BE"/>
@@ -1000,7 +1081,7 @@
       </w:rPr>
     </w:lvl>
   </w:abstractNum>
-  <w:abstractNum w:abstractNumId="7" w15:restartNumberingAfterBreak="0">
+  <w:abstractNum w:abstractNumId="8" w15:restartNumberingAfterBreak="0">
     <w:nsid w:val="5995610B"/>
     <w:multiLevelType w:val="multilevel"/>
     <w:tmpl w:val="582E326A"/>
@@ -1113,7 +1194,7 @@
       </w:rPr>
     </w:lvl>
   </w:abstractNum>
-  <w:abstractNum w:abstractNumId="8" w15:restartNumberingAfterBreak="0">
+  <w:abstractNum w:abstractNumId="9" w15:restartNumberingAfterBreak="0">
     <w:nsid w:val="79E8199A"/>
     <w:multiLevelType w:val="multilevel"/>
     <w:tmpl w:val="B42C8BC4"/>
@@ -1227,13 +1308,13 @@
     </w:lvl>
   </w:abstractNum>
   <w:num w:numId="1" w16cid:durableId="1066103106">
-    <w:abstractNumId w:val="6"/>
+    <w:abstractNumId w:val="7"/>
   </w:num>
   <w:num w:numId="2" w16cid:durableId="1664043964">
     <w:abstractNumId w:val="4"/>
   </w:num>
   <w:num w:numId="3" w16cid:durableId="798569257">
-    <w:abstractNumId w:val="7"/>
+    <w:abstractNumId w:val="8"/>
   </w:num>
   <w:num w:numId="4" w16cid:durableId="1615747550">
     <w:abstractNumId w:val="3"/>
@@ -1248,10 +1329,13 @@
     <w:abstractNumId w:val="5"/>
   </w:num>
   <w:num w:numId="8" w16cid:durableId="2012682491">
-    <w:abstractNumId w:val="8"/>
+    <w:abstractNumId w:val="9"/>
   </w:num>
   <w:num w:numId="9" w16cid:durableId="584412077">
     <w:abstractNumId w:val="2"/>
+  </w:num>
+  <w:num w:numId="10" w16cid:durableId="238835649">
+    <w:abstractNumId w:val="6"/>
   </w:num>
 </w:numbering>
 </file>

</xml_diff>